<commit_message>
PUI methods peer review update
</commit_message>
<xml_diff>
--- a/project-1-pui-methods/code materials/Code guide and dictionary (readme).docx
+++ b/project-1-pui-methods/code materials/Code guide and dictionary (readme).docx
@@ -1,6 +1,6 @@
 
 <file path=word/document.xml><?xml version="1.0" encoding="utf-8"?>
-<w:document xmlns:wpc="http://schemas.microsoft.com/office/word/2010/wordprocessingCanvas" xmlns:cx="http://schemas.microsoft.com/office/drawing/2014/chartex" xmlns:cx1="http://schemas.microsoft.com/office/drawing/2015/9/8/chartex" xmlns:cx2="http://schemas.microsoft.com/office/drawing/2015/10/21/chartex" xmlns:cx3="http://schemas.microsoft.com/office/drawing/2016/5/9/chartex" xmlns:cx4="http://schemas.microsoft.com/office/drawing/2016/5/10/chartex" xmlns:cx5="http://schemas.microsoft.com/office/drawing/2016/5/11/chartex" xmlns:cx6="http://schemas.microsoft.com/office/drawing/2016/5/12/chartex" xmlns:cx7="http://schemas.microsoft.com/office/drawing/2016/5/13/chartex" xmlns:cx8="http://schemas.microsoft.com/office/drawing/2016/5/14/chartex" xmlns:mc="http://schemas.openxmlformats.org/markup-compatibility/2006" xmlns:aink="http://schemas.microsoft.com/office/drawing/2016/ink" xmlns:am3d="http://schemas.microsoft.com/office/drawing/2017/model3d" xmlns:o="urn:schemas-microsoft-com:office:office" xmlns:oel="http://schemas.microsoft.com/office/2019/extlst" xmlns:r="http://schemas.openxmlformats.org/officeDocument/2006/relationships" xmlns:m="http://schemas.openxmlformats.org/officeDocument/2006/math" xmlns:v="urn:schemas-microsoft-com:vml" xmlns:wp14="http://schemas.microsoft.com/office/word/2010/wordprocessingDrawing" xmlns:wp="http://schemas.openxmlformats.org/drawingml/2006/wordprocessingDrawing" xmlns:w10="urn:schemas-microsoft-com:office:word" xmlns:w="http://schemas.openxmlformats.org/wordprocessingml/2006/main" xmlns:w14="http://schemas.microsoft.com/office/word/2010/wordml" xmlns:w15="http://schemas.microsoft.com/office/word/2012/wordml" xmlns:w16cex="http://schemas.microsoft.com/office/word/2018/wordml/cex" xmlns:w16cid="http://schemas.microsoft.com/office/word/2016/wordml/cid" xmlns:w16="http://schemas.microsoft.com/office/word/2018/wordml" xmlns:w16du="http://schemas.microsoft.com/office/word/2023/wordml/word16du" xmlns:w16sdtdh="http://schemas.microsoft.com/office/word/2020/wordml/sdtdatahash" xmlns:w16sdtfl="http://schemas.microsoft.com/office/word/2024/wordml/sdtformatlock" xmlns:w16se="http://schemas.microsoft.com/office/word/2015/wordml/symex" xmlns:wpg="http://schemas.microsoft.com/office/word/2010/wordprocessingGroup" xmlns:wpi="http://schemas.microsoft.com/office/word/2010/wordprocessingInk" xmlns:wne="http://schemas.microsoft.com/office/word/2006/wordml" xmlns:wps="http://schemas.microsoft.com/office/word/2010/wordprocessingShape" mc:Ignorable="w14 w15 w16se w16cid w16 w16cex w16sdtdh w16sdtfl w16du wp14">
+<w:document xmlns:wpc="http://schemas.microsoft.com/office/word/2010/wordprocessingCanvas" xmlns:cx="http://schemas.microsoft.com/office/drawing/2014/chartex" xmlns:cx1="http://schemas.microsoft.com/office/drawing/2015/9/8/chartex" xmlns:cx2="http://schemas.microsoft.com/office/drawing/2015/10/21/chartex" xmlns:cx3="http://schemas.microsoft.com/office/drawing/2016/5/9/chartex" xmlns:cx4="http://schemas.microsoft.com/office/drawing/2016/5/10/chartex" xmlns:cx5="http://schemas.microsoft.com/office/drawing/2016/5/11/chartex" xmlns:cx6="http://schemas.microsoft.com/office/drawing/2016/5/12/chartex" xmlns:cx7="http://schemas.microsoft.com/office/drawing/2016/5/13/chartex" xmlns:cx8="http://schemas.microsoft.com/office/drawing/2016/5/14/chartex" xmlns:mc="http://schemas.openxmlformats.org/markup-compatibility/2006" xmlns:aink="http://schemas.microsoft.com/office/drawing/2016/ink" xmlns:am3d="http://schemas.microsoft.com/office/drawing/2017/model3d" xmlns:o="urn:schemas-microsoft-com:office:office" xmlns:oel="http://schemas.microsoft.com/office/2019/extlst" xmlns:r="http://schemas.openxmlformats.org/officeDocument/2006/relationships" xmlns:m="http://schemas.openxmlformats.org/officeDocument/2006/math" xmlns:v="urn:schemas-microsoft-com:vml" xmlns:wp14="http://schemas.microsoft.com/office/word/2010/wordprocessingDrawing" xmlns:wp="http://schemas.openxmlformats.org/drawingml/2006/wordprocessingDrawing" xmlns:w10="urn:schemas-microsoft-com:office:word" xmlns:w="http://schemas.openxmlformats.org/wordprocessingml/2006/main" xmlns:w14="http://schemas.microsoft.com/office/word/2010/wordml" xmlns:w15="http://schemas.microsoft.com/office/word/2012/wordml" xmlns:w16cei="http://schemas.microsoft.com/office/word/2026/wordml/cei" xmlns:w16cex="http://schemas.microsoft.com/office/word/2018/wordml/cex" xmlns:w16cid="http://schemas.microsoft.com/office/word/2016/wordml/cid" xmlns:w16="http://schemas.microsoft.com/office/word/2018/wordml" xmlns:w16du="http://schemas.microsoft.com/office/word/2023/wordml/word16du" xmlns:w16sdtdh="http://schemas.microsoft.com/office/word/2020/wordml/sdtdatahash" xmlns:w16sdtfl="http://schemas.microsoft.com/office/word/2024/wordml/sdtformatlock" xmlns:w16se="http://schemas.microsoft.com/office/word/2015/wordml/symex" xmlns:wpg="http://schemas.microsoft.com/office/word/2010/wordprocessingGroup" xmlns:wpi="http://schemas.microsoft.com/office/word/2010/wordprocessingInk" xmlns:wne="http://schemas.microsoft.com/office/word/2006/wordml" xmlns:wps="http://schemas.microsoft.com/office/word/2010/wordprocessingShape" mc:Ignorable="w14 w15 w16se w16cid w16 w16cex w16sdtdh w16sdtfl w16du wp14">
   <w:body>
     <w:p>
       <w:pPr>
@@ -25,12 +25,43 @@
         <w:t>methods</w:t>
       </w:r>
       <w:r>
+        <w:t>’</w:t>
+      </w:r>
+      <w:r>
         <w:t>.</w:t>
       </w:r>
     </w:p>
     <w:p>
-      <w:r>
-        <w:t>This guide explains how to use the code which implemented all the analyses in the manuscript CHARIOT – a prediction under intervention model… XXXX.</w:t>
+      <w:pPr>
+        <w:rPr>
+          <w:b/>
+          <w:bCs/>
+        </w:rPr>
+      </w:pPr>
+      <w:r>
+        <w:t xml:space="preserve">This guide explains how to use the code which implemented all the analyses in the manuscript </w:t>
+      </w:r>
+      <w:r>
+        <w:rPr>
+          <w:b/>
+          <w:bCs/>
+        </w:rPr>
+        <w:t>A flexible approach to prediction under intervention.</w:t>
+      </w:r>
+      <w:r>
+        <w:rPr>
+          <w:b/>
+          <w:bCs/>
+        </w:rPr>
+        <w:br/>
+      </w:r>
+      <w:r>
+        <w:rPr>
+          <w:b/>
+          <w:bCs/>
+        </w:rPr>
+        <w:br/>
+        <w:t>XXXX ADD REF IF/WHEN PUBLISHED</w:t>
       </w:r>
     </w:p>
     <w:p>
@@ -43,7 +74,13 @@
     </w:p>
     <w:p>
       <w:r>
-        <w:t>All analyses were run in R version 4.4.1.</w:t>
+        <w:t>All analyses were run in R version 4.4.</w:t>
+      </w:r>
+      <w:r>
+        <w:t>2</w:t>
+      </w:r>
+      <w:r>
+        <w:t>.</w:t>
       </w:r>
     </w:p>
     <w:p>
@@ -54,15 +91,28 @@
         <w:t xml:space="preserve">using </w:t>
       </w:r>
       <w:proofErr w:type="spellStart"/>
+      <w:proofErr w:type="gramStart"/>
       <w:r>
         <w:t>setwd</w:t>
       </w:r>
       <w:proofErr w:type="spellEnd"/>
       <w:r>
-        <w:t xml:space="preserve">() </w:t>
-      </w:r>
-      <w:r>
-        <w:t>at the top of every .R file. Sadly, we could not find a way to get the ‘here’ package working with the computational facility and data storage requirements we had.</w:t>
+        <w:t>(</w:t>
+      </w:r>
+      <w:proofErr w:type="gramEnd"/>
+      <w:r>
+        <w:t xml:space="preserve">) </w:t>
+      </w:r>
+      <w:r>
+        <w:t xml:space="preserve">at the top of </w:t>
+      </w:r>
+      <w:proofErr w:type="gramStart"/>
+      <w:r>
+        <w:t>every .R</w:t>
+      </w:r>
+      <w:proofErr w:type="gramEnd"/>
+      <w:r>
+        <w:t xml:space="preserve"> file.</w:t>
       </w:r>
     </w:p>
     <w:p>
@@ -72,23 +122,53 @@
     </w:p>
     <w:p>
       <w:r>
-        <w:t xml:space="preserve">The ‘data’ and ‘figures’ folders should contain a subfolder ‘p4’, in which </w:t>
-      </w:r>
-      <w:r>
-        <w:t>many data</w:t>
-      </w:r>
-      <w:r>
-        <w:t xml:space="preserve"> objects will be stored. The ‘R’ folder contains functions that have been written to be used repeatedly (e.g. estimating calibration plots, augmenting data, etc).</w:t>
+        <w:t>The ‘R’ folder contains functions that have been written to be used repeatedly (e.g. estimating calibration plots, augmenting data, etc).</w:t>
       </w:r>
     </w:p>
     <w:p>
       <w:r>
-        <w:t>The code itself is then all contained within a subfolder ‘p4’. Folders p1-p3 contain code from previous versions of the algorithm which have been omitted.</w:t>
+        <w:t>Inside ‘code’, there are then 8 subfolders, which we detail the contents of here:</w:t>
       </w:r>
     </w:p>
     <w:p>
       <w:r>
-        <w:t>Inside ‘code’, there are then 8 subfolders, which we detail the contents of here:</w:t>
+        <w:rPr>
+          <w:b/>
+          <w:bCs/>
+        </w:rPr>
+        <w:t>p</w:t>
+      </w:r>
+      <w:r>
+        <w:rPr>
+          <w:b/>
+          <w:bCs/>
+        </w:rPr>
+        <w:t>1_data_prep:</w:t>
+      </w:r>
+      <w:r>
+        <w:t xml:space="preserve"> data preparation and imputation</w:t>
+      </w:r>
+      <w:r>
+        <w:t xml:space="preserve"> (see </w:t>
+      </w:r>
+      <w:r>
+        <w:rPr>
+          <w:i/>
+          <w:iCs/>
+        </w:rPr>
+        <w:t>p8_calculate_treatment_</w:t>
+      </w:r>
+      <w:proofErr w:type="gramStart"/>
+      <w:r>
+        <w:rPr>
+          <w:i/>
+          <w:iCs/>
+        </w:rPr>
+        <w:t>effects.R</w:t>
+      </w:r>
+      <w:proofErr w:type="gramEnd"/>
+      <w:r>
+        <w:t xml:space="preserve"> for accompanying code for the derivation of the DAG, supplementary data file 3).</w:t>
       </w:r>
     </w:p>
     <w:p>
@@ -104,10 +184,27 @@
           <w:b/>
           <w:bCs/>
         </w:rPr>
-        <w:t>1_data_prep:</w:t>
-      </w:r>
-      <w:r>
-        <w:t xml:space="preserve"> data preparation and imputation.</w:t>
+        <w:t>2_</w:t>
+      </w:r>
+      <w:r>
+        <w:rPr>
+          <w:b/>
+          <w:bCs/>
+        </w:rPr>
+        <w:t>devel</w:t>
+      </w:r>
+      <w:r>
+        <w:rPr>
+          <w:b/>
+          <w:bCs/>
+        </w:rPr>
+        <w:t>:</w:t>
+      </w:r>
+      <w:r>
+        <w:t xml:space="preserve"> </w:t>
+      </w:r>
+      <w:r>
+        <w:t>development and validation of models presented in the manuscript</w:t>
       </w:r>
     </w:p>
     <w:p>
@@ -116,21 +213,14 @@
           <w:b/>
           <w:bCs/>
         </w:rPr>
-        <w:t>p</w:t>
-      </w:r>
-      <w:r>
-        <w:rPr>
-          <w:b/>
-          <w:bCs/>
-        </w:rPr>
-        <w:t>2_</w:t>
-      </w:r>
-      <w:r>
-        <w:rPr>
-          <w:b/>
-          <w:bCs/>
-        </w:rPr>
-        <w:t>devel</w:t>
+        <w:t>p3_</w:t>
+      </w:r>
+      <w:r>
+        <w:rPr>
+          <w:b/>
+          <w:bCs/>
+        </w:rPr>
+        <w:t>sensitivity_treatment_effects</w:t>
       </w:r>
       <w:r>
         <w:rPr>
@@ -143,7 +233,10 @@
         <w:t xml:space="preserve"> </w:t>
       </w:r>
       <w:r>
-        <w:t>development and validation of models presented in the manuscript</w:t>
+        <w:t>Sensitivity analyses looking at model performance if the assumed treatment effects are different in the validation dataset</w:t>
+      </w:r>
+      <w:r>
+        <w:t>.</w:t>
       </w:r>
     </w:p>
     <w:p>
@@ -152,14 +245,21 @@
           <w:b/>
           <w:bCs/>
         </w:rPr>
-        <w:t>p3_</w:t>
-      </w:r>
-      <w:r>
-        <w:rPr>
-          <w:b/>
-          <w:bCs/>
-        </w:rPr>
-        <w:t>sensitivity_treatment_effects</w:t>
+        <w:t>p4</w:t>
+      </w:r>
+      <w:r>
+        <w:rPr>
+          <w:b/>
+          <w:bCs/>
+        </w:rPr>
+        <w:t>_</w:t>
+      </w:r>
+      <w:r>
+        <w:rPr>
+          <w:b/>
+          <w:bCs/>
+        </w:rPr>
+        <w:t>sensitivity_kvg_validation</w:t>
       </w:r>
       <w:r>
         <w:rPr>
@@ -172,10 +272,29 @@
         <w:t xml:space="preserve"> </w:t>
       </w:r>
       <w:r>
-        <w:t>Sensitivity analyses looking at model performance if the assumed treatment effects are different in the validation dataset</w:t>
-      </w:r>
-      <w:r>
-        <w:t>.</w:t>
+        <w:t>Sensitivity analyses assessing model performance using the artificial censoring approach of Keo</w:t>
+      </w:r>
+      <w:r>
+        <w:t>gh and Van Geloven.</w:t>
+      </w:r>
+      <w:r>
+        <w:fldChar w:fldCharType="begin"/>
+      </w:r>
+      <w:r>
+        <w:instrText xml:space="preserve"> ADDIN EN.CITE &lt;EndNote&gt;&lt;Cite&gt;&lt;Author&gt;Keogh&lt;/Author&gt;&lt;Year&gt;2024&lt;/Year&gt;&lt;RecNum&gt;1549&lt;/RecNum&gt;&lt;DisplayText&gt;&lt;style face="superscript"&gt;1&lt;/style&gt;&lt;/DisplayText&gt;&lt;record&gt;&lt;rec-number&gt;1549&lt;/rec-number&gt;&lt;foreign-keys&gt;&lt;key app="EN" db-id="twswaaew0fpxr5e00pu5ezsdrzsd2w5s5tst" timestamp="1778833217"&gt;1549&lt;/key&gt;&lt;/foreign-keys&gt;&lt;ref-type name="Journal Article"&gt;17&lt;/ref-type&gt;&lt;contributors&gt;&lt;authors&gt;&lt;author&gt;Keogh, R. H.&lt;/author&gt;&lt;author&gt;Van Geloven, N.&lt;/author&gt;&lt;/authors&gt;&lt;/contributors&gt;&lt;auth-address&gt;From the Department of Medical Statistics, London School of Hygiene &amp;amp; Tropical Medicine, London, United Kingdom.&amp;#xD;Department of Biomedical Data Sciences, Leiden University Medical Center, Leiden, the Netherlands.&lt;/auth-address&gt;&lt;titles&gt;&lt;title&gt;Prediction Under Interventions: Evaluation of Counterfactual Performance Using Longitudinal Observational Data&lt;/title&gt;&lt;secondary-title&gt;Epidemiology&lt;/secondary-title&gt;&lt;/titles&gt;&lt;periodical&gt;&lt;full-title&gt;Epidemiology&lt;/full-title&gt;&lt;/periodical&gt;&lt;pages&gt;329-339&lt;/pages&gt;&lt;volume&gt;35&lt;/volume&gt;&lt;number&gt;3&lt;/number&gt;&lt;edition&gt;20240418&lt;/edition&gt;&lt;keywords&gt;&lt;keyword&gt;Humans&lt;/keyword&gt;&lt;keyword&gt;Calibration&lt;/keyword&gt;&lt;keyword&gt;*Clinical Decision-Making&lt;/keyword&gt;&lt;keyword&gt;Computer Simulation&lt;/keyword&gt;&lt;keyword&gt;Observation&lt;/keyword&gt;&lt;keyword&gt;Probability&lt;/keyword&gt;&lt;/keywords&gt;&lt;dates&gt;&lt;year&gt;2024&lt;/year&gt;&lt;pub-dates&gt;&lt;date&gt;May 1&lt;/date&gt;&lt;/pub-dates&gt;&lt;/dates&gt;&lt;isbn&gt;1531-5487 (Electronic)&amp;#xD;1044-3983 (Print)&amp;#xD;1044-3983 (Linking)&lt;/isbn&gt;&lt;accession-num&gt;38630508&lt;/accession-num&gt;&lt;urls&gt;&lt;related-urls&gt;&lt;url&gt;https://www.ncbi.nlm.nih.gov/pubmed/38630508&lt;/url&gt;&lt;/related-urls&gt;&lt;/urls&gt;&lt;custom1&gt;The authors report no conflicts of interest.&lt;/custom1&gt;&lt;custom2&gt;PMC11332371&lt;/custom2&gt;&lt;electronic-resource-num&gt;10.1097/EDE.0000000000001713&lt;/electronic-resource-num&gt;&lt;remote-database-name&gt;Medline&lt;/remote-database-name&gt;&lt;remote-database-provider&gt;NLM&lt;/remote-database-provider&gt;&lt;/record&gt;&lt;/Cite&gt;&lt;/EndNote&gt;</w:instrText>
+      </w:r>
+      <w:r>
+        <w:fldChar w:fldCharType="separate"/>
+      </w:r>
+      <w:r>
+        <w:rPr>
+          <w:noProof/>
+          <w:vertAlign w:val="superscript"/>
+        </w:rPr>
+        <w:t>1</w:t>
+      </w:r>
+      <w:r>
+        <w:fldChar w:fldCharType="end"/>
       </w:r>
     </w:p>
     <w:p>
@@ -184,7 +303,7 @@
           <w:b/>
           <w:bCs/>
         </w:rPr>
-        <w:t>p4</w:t>
+        <w:t>p5</w:t>
       </w:r>
       <w:r>
         <w:rPr>
@@ -198,14 +317,7 @@
           <w:b/>
           <w:bCs/>
         </w:rPr>
-        <w:t>sensitivity</w:t>
-      </w:r>
-      <w:r>
-        <w:rPr>
-          <w:b/>
-          <w:bCs/>
-        </w:rPr>
-        <w:t>_kvg_validation</w:t>
+        <w:t>sensitivity_imputation</w:t>
       </w:r>
       <w:r>
         <w:rPr>
@@ -218,29 +330,23 @@
         <w:t xml:space="preserve"> </w:t>
       </w:r>
       <w:r>
-        <w:t>Sensitivity analyses assessing model performance using the artificial censoring approach of Keo</w:t>
-      </w:r>
-      <w:r>
-        <w:t>gh and Van Geloven.</w:t>
-      </w:r>
-      <w:r>
-        <w:fldChar w:fldCharType="begin"/>
-      </w:r>
-      <w:r>
-        <w:instrText xml:space="preserve"> ADDIN EN.CITE &lt;EndNote&gt;&lt;Cite&gt;&lt;Author&gt;Keogh&lt;/Author&gt;&lt;Year&gt;2024&lt;/Year&gt;&lt;RecNum&gt;1549&lt;/RecNum&gt;&lt;DisplayText&gt;&lt;style face="superscript"&gt;1&lt;/style&gt;&lt;/DisplayText&gt;&lt;record&gt;&lt;rec-number&gt;1549&lt;/rec-number&gt;&lt;foreign-keys&gt;&lt;key app="EN" db-id="twswaaew0fpxr5e00pu5ezsdrzsd2w5s5tst" timestamp="1778833217"&gt;1549&lt;/key&gt;&lt;/foreign-keys&gt;&lt;ref-type name="Journal Article"&gt;17&lt;/ref-type&gt;&lt;contributors&gt;&lt;authors&gt;&lt;author&gt;Keogh, R. H.&lt;/author&gt;&lt;author&gt;Van Geloven, N.&lt;/author&gt;&lt;/authors&gt;&lt;/contributors&gt;&lt;auth-address&gt;From the Department of Medical Statistics, London School of Hygiene &amp;amp; Tropical Medicine, London, United Kingdom.&amp;#xD;Department of Biomedical Data Sciences, Leiden University Medical Center, Leiden, the Netherlands.&lt;/auth-address&gt;&lt;titles&gt;&lt;title&gt;Prediction Under Interventions: Evaluation of Counterfactual Performance Using Longitudinal Observational Data&lt;/title&gt;&lt;secondary-title&gt;Epidemiology&lt;/secondary-title&gt;&lt;/titles&gt;&lt;periodical&gt;&lt;full-title&gt;Epidemiology&lt;/full-title&gt;&lt;/periodical&gt;&lt;pages&gt;329-339&lt;/pages&gt;&lt;volume&gt;35&lt;/volume&gt;&lt;number&gt;3&lt;/number&gt;&lt;edition&gt;20240418&lt;/edition&gt;&lt;keywords&gt;&lt;keyword&gt;Humans&lt;/keyword&gt;&lt;keyword&gt;Calibration&lt;/keyword&gt;&lt;keyword&gt;*Clinical Decision-Making&lt;/keyword&gt;&lt;keyword&gt;Computer Simulation&lt;/keyword&gt;&lt;keyword&gt;Observation&lt;/keyword&gt;&lt;keyword&gt;Probability&lt;/keyword&gt;&lt;/keywords&gt;&lt;dates&gt;&lt;year&gt;2024&lt;/year&gt;&lt;pub-dates&gt;&lt;date&gt;May 1&lt;/date&gt;&lt;/pub-dates&gt;&lt;/dates&gt;&lt;isbn&gt;1531-5487 (Electronic)&amp;#xD;1044-3983 (Print)&amp;#xD;1044-3983 (Linking)&lt;/isbn&gt;&lt;accession-num&gt;38630508&lt;/accession-num&gt;&lt;urls&gt;&lt;related-urls&gt;&lt;url&gt;https://www.ncbi.nlm.nih.gov/pubmed/38630508&lt;/url&gt;&lt;/related-urls&gt;&lt;/urls&gt;&lt;custom1&gt;The authors report no conflicts of interest.&lt;/custom1&gt;&lt;custom2&gt;PMC11332371&lt;/custom2&gt;&lt;electronic-resource-num&gt;10.1097/EDE.0000000000001713&lt;/electronic-resource-num&gt;&lt;remote-database-name&gt;Medline&lt;/remote-database-name&gt;&lt;remote-database-provider&gt;NLM&lt;/remote-database-provider&gt;&lt;/record&gt;&lt;/Cite&gt;&lt;/EndNote&gt;</w:instrText>
-      </w:r>
-      <w:r>
-        <w:fldChar w:fldCharType="separate"/>
-      </w:r>
-      <w:r>
-        <w:rPr>
-          <w:noProof/>
-          <w:vertAlign w:val="superscript"/>
-        </w:rPr>
-        <w:t>1</w:t>
-      </w:r>
-      <w:r>
-        <w:fldChar w:fldCharType="end"/>
+        <w:t xml:space="preserve">Sensitivity analyses inspecting </w:t>
+      </w:r>
+      <w:proofErr w:type="gramStart"/>
+      <w:r>
+        <w:t>performance  of</w:t>
+      </w:r>
+      <w:proofErr w:type="gramEnd"/>
+      <w:r>
+        <w:t xml:space="preserve"> model 2 stratified by those with imputed unexposed systolic blood pressure </w:t>
+      </w:r>
+      <w:proofErr w:type="gramStart"/>
+      <w:r>
+        <w:t>measurements, and</w:t>
+      </w:r>
+      <w:proofErr w:type="gramEnd"/>
+      <w:r>
+        <w:t xml:space="preserve"> evaluating the assumptions of the imputation mechanism.</w:t>
       </w:r>
     </w:p>
     <w:p>
@@ -249,7 +355,7 @@
           <w:b/>
           <w:bCs/>
         </w:rPr>
-        <w:t>p5</w:t>
+        <w:t>p6</w:t>
       </w:r>
       <w:r>
         <w:rPr>
@@ -263,14 +369,14 @@
           <w:b/>
           <w:bCs/>
         </w:rPr>
-        <w:t>sensitivity</w:t>
-      </w:r>
-      <w:r>
-        <w:rPr>
-          <w:b/>
-          <w:bCs/>
-        </w:rPr>
-        <w:t>_imputation</w:t>
+        <w:t>sensitivity_</w:t>
+      </w:r>
+      <w:r>
+        <w:rPr>
+          <w:b/>
+          <w:bCs/>
+        </w:rPr>
+        <w:t>direct_effect_statins</w:t>
       </w:r>
       <w:r>
         <w:rPr>
@@ -283,7 +389,10 @@
         <w:t xml:space="preserve"> </w:t>
       </w:r>
       <w:r>
-        <w:t>Sensitivity analyses inspecting performance  of model 2 stratified by those with imputed unexposed systolic blood pressure measurements, and evaluating the assumptions of the imputation mechanism.</w:t>
+        <w:t>Sensitivity analyses</w:t>
+      </w:r>
+      <w:r>
+        <w:t xml:space="preserve"> considering a direct effect of statin treatment.</w:t>
       </w:r>
     </w:p>
     <w:p>
@@ -292,7 +401,7 @@
           <w:b/>
           <w:bCs/>
         </w:rPr>
-        <w:t>p6</w:t>
+        <w:t>p7</w:t>
       </w:r>
       <w:r>
         <w:rPr>
@@ -306,21 +415,14 @@
           <w:b/>
           <w:bCs/>
         </w:rPr>
-        <w:t>sensitivity</w:t>
-      </w:r>
-      <w:r>
-        <w:rPr>
-          <w:b/>
-          <w:bCs/>
-        </w:rPr>
-        <w:t>_</w:t>
-      </w:r>
-      <w:r>
-        <w:rPr>
-          <w:b/>
-          <w:bCs/>
-        </w:rPr>
-        <w:t>direct_effect_statins</w:t>
+        <w:t>sensitivity_</w:t>
+      </w:r>
+      <w:r>
+        <w:rPr>
+          <w:b/>
+          <w:bCs/>
+        </w:rPr>
+        <w:t>temporal</w:t>
       </w:r>
       <w:r>
         <w:rPr>
@@ -330,13 +432,10 @@
         <w:t>:</w:t>
       </w:r>
       <w:r>
-        <w:t xml:space="preserve"> </w:t>
-      </w:r>
-      <w:r>
-        <w:t>Sensitivity analyses</w:t>
-      </w:r>
-      <w:r>
-        <w:t xml:space="preserve"> considering a direct effect of statin treatment.</w:t>
+        <w:t xml:space="preserve"> Sensitivity analyses </w:t>
+      </w:r>
+      <w:r>
+        <w:t>validating the initial risk estimation component in a temporal manner.</w:t>
       </w:r>
     </w:p>
     <w:p>
@@ -387,21 +486,52 @@
     </w:p>
     <w:p>
       <w:r>
-        <w:t>Within each of these folders, .R files are all prefixed with ‘p1’, ‘p2’, …., and are designed to be run in order. Often (but not always), subsequent .R files are dependent on objects created in previous .R files.</w:t>
+        <w:t>Within each of these folders</w:t>
+      </w:r>
+      <w:proofErr w:type="gramStart"/>
+      <w:r>
+        <w:t>, .R</w:t>
+      </w:r>
+      <w:proofErr w:type="gramEnd"/>
+      <w:r>
+        <w:t xml:space="preserve"> files are all prefixed with ‘p1’, ‘p2’, …., and are designed to be run in order. Often (but not always), </w:t>
+      </w:r>
+      <w:proofErr w:type="gramStart"/>
+      <w:r>
+        <w:t>subsequent .R</w:t>
+      </w:r>
+      <w:proofErr w:type="gramEnd"/>
+      <w:r>
+        <w:t xml:space="preserve"> files are dependent on objects created in </w:t>
+      </w:r>
+      <w:proofErr w:type="gramStart"/>
+      <w:r>
+        <w:t>previous .R</w:t>
+      </w:r>
+      <w:proofErr w:type="gramEnd"/>
+      <w:r>
+        <w:t xml:space="preserve"> files.</w:t>
       </w:r>
     </w:p>
     <w:p>
-      <w:r>
-        <w:t>Many .R files are ran over different input parameters (e.g. gender; different amounts of miss-specification in</w:t>
-      </w:r>
-      <w:r>
-        <w:t xml:space="preserve"> </w:t>
-      </w:r>
-      <w:r>
-        <w:t>p3_sensitivity_treatment_effects</w:t>
-      </w:r>
-      <w:r>
-        <w:t xml:space="preserve">; </w:t>
+      <w:proofErr w:type="gramStart"/>
+      <w:r>
+        <w:t>Many .R</w:t>
+      </w:r>
+      <w:proofErr w:type="gramEnd"/>
+      <w:r>
+        <w:t xml:space="preserve"> files are </w:t>
+      </w:r>
+      <w:proofErr w:type="gramStart"/>
+      <w:r>
+        <w:t>ran</w:t>
+      </w:r>
+      <w:proofErr w:type="gramEnd"/>
+      <w:r>
+        <w:t xml:space="preserve"> over different input parameters (e.g. gender; different amounts of miss-specification in</w:t>
+      </w:r>
+      <w:r>
+        <w:t xml:space="preserve"> p3_sensitivity_treatment_effects; </w:t>
       </w:r>
       <w:r>
         <w:t xml:space="preserve">different follow-up times in </w:t>
@@ -422,13 +552,18 @@
       </w:r>
       <w:proofErr w:type="spellEnd"/>
       <w:r>
-        <w:t xml:space="preserve"> files, or .</w:t>
+        <w:t xml:space="preserve"> files, </w:t>
+      </w:r>
+      <w:proofErr w:type="gramStart"/>
+      <w:r>
+        <w:t>or .</w:t>
       </w:r>
       <w:proofErr w:type="spellStart"/>
       <w:r>
         <w:t>slurm</w:t>
       </w:r>
       <w:proofErr w:type="spellEnd"/>
+      <w:proofErr w:type="gramEnd"/>
       <w:r>
         <w:t xml:space="preserve"> files. Please refer to these files to see the range of input parameters analyses have been run over.</w:t>
       </w:r>
@@ -451,10 +586,7 @@
       </w:r>
       <w:proofErr w:type="spellEnd"/>
       <w:r>
-        <w:t xml:space="preserve"> objects. </w:t>
-      </w:r>
-      <w:r>
-        <w:t>The process for doing so is detailed in</w:t>
+        <w:t xml:space="preserve"> objects. The process for doing so is detailed in</w:t>
       </w:r>
       <w:r>
         <w:t xml:space="preserve"> the generic-data-extraction rep</w:t>
@@ -481,7 +613,6 @@
         <w:t>The code is therefore not fully re-usable without some minor edits required, which are detailed here. These edits are all required in the data preparation folders (p1_data_prep) and (p2_data_prep_further_mfr).</w:t>
       </w:r>
     </w:p>
-    <w:p/>
     <w:p/>
     <w:p>
       <w:pPr>
@@ -529,7 +660,7 @@
 </file>
 
 <file path=word/numbering.xml><?xml version="1.0" encoding="utf-8"?>
-<w:numbering xmlns:wpc="http://schemas.microsoft.com/office/word/2010/wordprocessingCanvas" xmlns:cx="http://schemas.microsoft.com/office/drawing/2014/chartex" xmlns:cx1="http://schemas.microsoft.com/office/drawing/2015/9/8/chartex" xmlns:cx2="http://schemas.microsoft.com/office/drawing/2015/10/21/chartex" xmlns:cx3="http://schemas.microsoft.com/office/drawing/2016/5/9/chartex" xmlns:cx4="http://schemas.microsoft.com/office/drawing/2016/5/10/chartex" xmlns:cx5="http://schemas.microsoft.com/office/drawing/2016/5/11/chartex" xmlns:cx6="http://schemas.microsoft.com/office/drawing/2016/5/12/chartex" xmlns:cx7="http://schemas.microsoft.com/office/drawing/2016/5/13/chartex" xmlns:cx8="http://schemas.microsoft.com/office/drawing/2016/5/14/chartex" xmlns:mc="http://schemas.openxmlformats.org/markup-compatibility/2006" xmlns:aink="http://schemas.microsoft.com/office/drawing/2016/ink" xmlns:am3d="http://schemas.microsoft.com/office/drawing/2017/model3d" xmlns:o="urn:schemas-microsoft-com:office:office" xmlns:oel="http://schemas.microsoft.com/office/2019/extlst" xmlns:r="http://schemas.openxmlformats.org/officeDocument/2006/relationships" xmlns:m="http://schemas.openxmlformats.org/officeDocument/2006/math" xmlns:v="urn:schemas-microsoft-com:vml" xmlns:wp14="http://schemas.microsoft.com/office/word/2010/wordprocessingDrawing" xmlns:wp="http://schemas.openxmlformats.org/drawingml/2006/wordprocessingDrawing" xmlns:w10="urn:schemas-microsoft-com:office:word" xmlns:w="http://schemas.openxmlformats.org/wordprocessingml/2006/main" xmlns:w14="http://schemas.microsoft.com/office/word/2010/wordml" xmlns:w15="http://schemas.microsoft.com/office/word/2012/wordml" xmlns:w16cex="http://schemas.microsoft.com/office/word/2018/wordml/cex" xmlns:w16cid="http://schemas.microsoft.com/office/word/2016/wordml/cid" xmlns:w16="http://schemas.microsoft.com/office/word/2018/wordml" xmlns:w16du="http://schemas.microsoft.com/office/word/2023/wordml/word16du" xmlns:w16sdtdh="http://schemas.microsoft.com/office/word/2020/wordml/sdtdatahash" xmlns:w16sdtfl="http://schemas.microsoft.com/office/word/2024/wordml/sdtformatlock" xmlns:w16se="http://schemas.microsoft.com/office/word/2015/wordml/symex" xmlns:wpg="http://schemas.microsoft.com/office/word/2010/wordprocessingGroup" xmlns:wpi="http://schemas.microsoft.com/office/word/2010/wordprocessingInk" xmlns:wne="http://schemas.microsoft.com/office/word/2006/wordml" xmlns:wps="http://schemas.microsoft.com/office/word/2010/wordprocessingShape" mc:Ignorable="w14 w15 w16se w16cid w16 w16cex w16sdtdh w16sdtfl w16du wp14">
+<w:numbering xmlns:wpc="http://schemas.microsoft.com/office/word/2010/wordprocessingCanvas" xmlns:cx="http://schemas.microsoft.com/office/drawing/2014/chartex" xmlns:cx1="http://schemas.microsoft.com/office/drawing/2015/9/8/chartex" xmlns:cx2="http://schemas.microsoft.com/office/drawing/2015/10/21/chartex" xmlns:cx3="http://schemas.microsoft.com/office/drawing/2016/5/9/chartex" xmlns:cx4="http://schemas.microsoft.com/office/drawing/2016/5/10/chartex" xmlns:cx5="http://schemas.microsoft.com/office/drawing/2016/5/11/chartex" xmlns:cx6="http://schemas.microsoft.com/office/drawing/2016/5/12/chartex" xmlns:cx7="http://schemas.microsoft.com/office/drawing/2016/5/13/chartex" xmlns:cx8="http://schemas.microsoft.com/office/drawing/2016/5/14/chartex" xmlns:mc="http://schemas.openxmlformats.org/markup-compatibility/2006" xmlns:aink="http://schemas.microsoft.com/office/drawing/2016/ink" xmlns:am3d="http://schemas.microsoft.com/office/drawing/2017/model3d" xmlns:o="urn:schemas-microsoft-com:office:office" xmlns:oel="http://schemas.microsoft.com/office/2019/extlst" xmlns:r="http://schemas.openxmlformats.org/officeDocument/2006/relationships" xmlns:m="http://schemas.openxmlformats.org/officeDocument/2006/math" xmlns:v="urn:schemas-microsoft-com:vml" xmlns:wp14="http://schemas.microsoft.com/office/word/2010/wordprocessingDrawing" xmlns:wp="http://schemas.openxmlformats.org/drawingml/2006/wordprocessingDrawing" xmlns:w10="urn:schemas-microsoft-com:office:word" xmlns:w="http://schemas.openxmlformats.org/wordprocessingml/2006/main" xmlns:w14="http://schemas.microsoft.com/office/word/2010/wordml" xmlns:w15="http://schemas.microsoft.com/office/word/2012/wordml" xmlns:w16cei="http://schemas.microsoft.com/office/word/2026/wordml/cei" xmlns:w16cex="http://schemas.microsoft.com/office/word/2018/wordml/cex" xmlns:w16cid="http://schemas.microsoft.com/office/word/2016/wordml/cid" xmlns:w16="http://schemas.microsoft.com/office/word/2018/wordml" xmlns:w16du="http://schemas.microsoft.com/office/word/2023/wordml/word16du" xmlns:w16sdtdh="http://schemas.microsoft.com/office/word/2020/wordml/sdtdatahash" xmlns:w16sdtfl="http://schemas.microsoft.com/office/word/2024/wordml/sdtformatlock" xmlns:w16se="http://schemas.microsoft.com/office/word/2015/wordml/symex" xmlns:wpg="http://schemas.microsoft.com/office/word/2010/wordprocessingGroup" xmlns:wpi="http://schemas.microsoft.com/office/word/2010/wordprocessingInk" xmlns:wne="http://schemas.microsoft.com/office/word/2006/wordml" xmlns:wps="http://schemas.microsoft.com/office/word/2010/wordprocessingShape" mc:Ignorable="w14 w15 w16se w16cid w16 w16cex w16sdtdh w16sdtfl w16du wp14">
   <w:abstractNum w:abstractNumId="0" w15:restartNumberingAfterBreak="0">
     <w:nsid w:val="13DD474B"/>
     <w:multiLevelType w:val="multilevel"/>
@@ -1490,6 +1621,7 @@
   <w:style w:type="character" w:default="1" w:styleId="DefaultParagraphFont">
     <w:name w:val="Default Paragraph Font"/>
     <w:uiPriority w:val="1"/>
+    <w:semiHidden/>
     <w:unhideWhenUsed/>
   </w:style>
   <w:style w:type="table" w:default="1" w:styleId="TableNormal">

</xml_diff>